<commit_message>
docs(lab): perbarui panduan dan lembar laporan lab 6 dan lab 7 selaras runtime
</commit_message>
<xml_diff>
--- a/lab/lab6-monitoring/lembar-laporan.docx
+++ b/lab/lab6-monitoring/lembar-laporan.docx
@@ -27,7 +27,7 @@
           <w:color w:val="1E293B"/>
           <w:sz w:val="21"/>
         </w:rPr>
-        <w:t>Modul MP-09 · Hari 5 (Jumat, 18 September 2026) · Praktik 4 JP (180 Menit)</w:t>
+        <w:t>Modul MP-09 · Hari 5 (Jumat, 18 September 2026) · Sesi Praktik 2 JP (90 Menit)</w:t>
       </w:r>
     </w:p>
     <w:p>
@@ -2431,7 +2431,7 @@
                 <w:color w:val="1E293B"/>
                 <w:sz w:val="19"/>
               </w:rPr>
-              <w:t>3. Deklarasi Queue Baru (`lab6.hacker.q`)</w:t>
+              <w:t>3. Deklarasi Queue Baru (`lab6.forbidden`)</w:t>
             </w:r>
           </w:p>
         </w:tc>

</xml_diff>